<commit_message>
Added Small Features (gw in per pro), Added Automatically Feature VGM and Fix Bugs when Generating Preadvise after DG DEC
</commit_message>
<xml_diff>
--- a/python/templates/KMTC_PRE_ADVISE_TEMPLATE.docx
+++ b/python/templates/KMTC_PRE_ADVISE_TEMPLATE.docx
@@ -288,21 +288,8 @@
           <w:sz w:val="20"/>
           <w:szCs w:val="20"/>
         </w:rPr>
-        <w:t xml:space="preserve">NO </w:t>
-      </w:r>
-      <w:proofErr w:type="gramStart"/>
-      <w:r>
-        <w:rPr>
-          <w:rFonts w:ascii="Segoe UI" w:hAnsi="Segoe UI" w:cs="Segoe UI"/>
-          <w:b/>
-          <w:i/>
-          <w:color w:val="FF0000"/>
-          <w:sz w:val="20"/>
-          <w:szCs w:val="20"/>
-        </w:rPr>
-        <w:t>PRE ADVISE</w:t>
-      </w:r>
-      <w:proofErr w:type="gramEnd"/>
+        <w:t>NO PRE ADVISE</w:t>
+      </w:r>
       <w:r>
         <w:rPr>
           <w:rFonts w:ascii="Segoe UI" w:hAnsi="Segoe UI" w:cs="Segoe UI"/>
@@ -972,25 +959,8 @@
                 <w:rFonts w:ascii="Segoe UI" w:hAnsi="Segoe UI" w:cs="Segoe UI"/>
                 <w:color w:val="0070C0"/>
               </w:rPr>
-              <w:t xml:space="preserve"> </w:t>
-            </w:r>
-            <w:proofErr w:type="gramStart"/>
-            <w:r>
-              <w:rPr>
-                <w:rFonts w:ascii="Segoe UI" w:hAnsi="Segoe UI" w:cs="Segoe UI"/>
-                <w:color w:val="0070C0"/>
-              </w:rPr>
-              <w:t>( kgs</w:t>
-            </w:r>
-            <w:proofErr w:type="gramEnd"/>
-            <w:r>
-              <w:rPr>
-                <w:rFonts w:ascii="Segoe UI" w:hAnsi="Segoe UI" w:cs="Segoe UI"/>
-                <w:color w:val="0070C0"/>
-              </w:rPr>
-              <w:t>)</w:t>
-            </w:r>
-            <w:proofErr w:type="gramStart"/>
+              <w:t xml:space="preserve"> ( kgs)</w:t>
+            </w:r>
             <w:r>
               <w:rPr>
                 <w:rFonts w:ascii="Segoe UI" w:hAnsi="Segoe UI" w:cs="Segoe UI"/>
@@ -1003,15 +973,7 @@
                 <w:rFonts w:ascii="Segoe UI" w:hAnsi="Segoe UI" w:cs="Segoe UI"/>
                 <w:color w:val="0070C0"/>
               </w:rPr>
-              <w:t>{</w:t>
-            </w:r>
-            <w:proofErr w:type="gramEnd"/>
-            <w:r>
-              <w:rPr>
-                <w:rFonts w:ascii="Segoe UI" w:hAnsi="Segoe UI" w:cs="Segoe UI"/>
-                <w:color w:val="0070C0"/>
-              </w:rPr>
-              <w:t>{CARGO_WEIGHT_KGS}}</w:t>
+              <w:t>{{CARGO_WEIGHT_KGS}}</w:t>
             </w:r>
           </w:p>
         </w:tc>
@@ -1071,7 +1033,7 @@
                 <w:rFonts w:ascii="Segoe UI" w:hAnsi="Segoe UI" w:cs="Segoe UI"/>
                 <w:color w:val="0070C0"/>
               </w:rPr>
-              <w:t>13,137.58</w:t>
+              <w:t>{{VGMD_KGS}}</w:t>
             </w:r>
           </w:p>
         </w:tc>
@@ -1125,23 +1087,7 @@
                 <w:rFonts w:ascii="Segoe UI" w:hAnsi="Segoe UI" w:cs="Segoe UI"/>
                 <w:color w:val="0070C0"/>
               </w:rPr>
-              <w:t xml:space="preserve"> </w:t>
-            </w:r>
-            <w:proofErr w:type="gramStart"/>
-            <w:r>
-              <w:rPr>
-                <w:rFonts w:ascii="Segoe UI" w:hAnsi="Segoe UI" w:cs="Segoe UI"/>
-                <w:color w:val="0070C0"/>
-              </w:rPr>
-              <w:t>( kgs</w:t>
-            </w:r>
-            <w:proofErr w:type="gramEnd"/>
-            <w:r>
-              <w:rPr>
-                <w:rFonts w:ascii="Segoe UI" w:hAnsi="Segoe UI" w:cs="Segoe UI"/>
-                <w:color w:val="0070C0"/>
-              </w:rPr>
-              <w:t>.)</w:t>
+              <w:t xml:space="preserve"> ( kgs.)</w:t>
             </w:r>
             <w:r>
               <w:rPr>
@@ -1624,25 +1570,7 @@
           <w:sz w:val="20"/>
           <w:szCs w:val="20"/>
         </w:rPr>
-        <w:t>e-</w:t>
-      </w:r>
-      <w:proofErr w:type="gramStart"/>
-      <w:r>
-        <w:rPr>
-          <w:rFonts w:ascii="Segoe UI" w:hAnsi="Segoe UI" w:cs="Segoe UI"/>
-          <w:sz w:val="20"/>
-          <w:szCs w:val="20"/>
-        </w:rPr>
-        <w:t>advise</w:t>
-      </w:r>
-      <w:proofErr w:type="gramEnd"/>
-      <w:r>
-        <w:rPr>
-          <w:rFonts w:ascii="Segoe UI" w:hAnsi="Segoe UI" w:cs="Segoe UI"/>
-          <w:sz w:val="20"/>
-          <w:szCs w:val="20"/>
-        </w:rPr>
-        <w:t xml:space="preserve"> requests </w:t>
+        <w:t xml:space="preserve">e-advise requests </w:t>
       </w:r>
       <w:r>
         <w:rPr>
@@ -2078,29 +2006,7 @@
           <w:sz w:val="20"/>
           <w:szCs w:val="20"/>
         </w:rPr>
-        <w:t>“NO VGM, NO PRE-</w:t>
-      </w:r>
-      <w:proofErr w:type="gramStart"/>
-      <w:r>
-        <w:rPr>
-          <w:rFonts w:ascii="Segoe UI" w:hAnsi="Segoe UI" w:cs="Segoe UI"/>
-          <w:b/>
-          <w:color w:val="FF0000"/>
-          <w:sz w:val="20"/>
-          <w:szCs w:val="20"/>
-        </w:rPr>
-        <w:t>ADVISE</w:t>
-      </w:r>
-      <w:proofErr w:type="gramEnd"/>
-      <w:r>
-        <w:rPr>
-          <w:rFonts w:ascii="Segoe UI" w:hAnsi="Segoe UI" w:cs="Segoe UI"/>
-          <w:b/>
-          <w:color w:val="FF0000"/>
-          <w:sz w:val="20"/>
-          <w:szCs w:val="20"/>
-        </w:rPr>
-        <w:t>”</w:t>
+        <w:t>“NO VGM, NO PRE-ADVISE”</w:t>
       </w:r>
       <w:r>
         <w:rPr>
@@ -3383,7 +3289,6 @@
     <w:uiPriority w:val="99"/>
     <w:semiHidden/>
     <w:unhideWhenUsed/>
-    <w:qFormat/>
     <w:tblPr>
       <w:tblInd w:w="0" w:type="dxa"/>
       <w:tblCellMar>
@@ -3827,10 +3732,6 @@
 </file>
 
 <file path=customXml/item1.xml><?xml version="1.0" encoding="utf-8"?>
-<b:Sources xmlns:b="http://schemas.openxmlformats.org/officeDocument/2006/bibliography" xmlns="http://schemas.openxmlformats.org/officeDocument/2006/bibliography" SelectedStyle="\APASixthEditionOfficeOnline.xsl" StyleName="APA" Version="6"/>
-</file>
-
-<file path=customXml/item2.xml><?xml version="1.0" encoding="utf-8"?>
 <ct:contentTypeSchema xmlns:ct="http://schemas.microsoft.com/office/2006/metadata/contentType" xmlns:ma="http://schemas.microsoft.com/office/2006/metadata/properties/metaAttributes" ct:_="" ma:_="" ma:contentTypeName="Document" ma:contentTypeID="0x01010052B03CCBB2D70D4BB9E5D46C16B903A2" ma:contentTypeVersion="11" ma:contentTypeDescription="Create a new document." ma:contentTypeScope="" ma:versionID="e995e8c46b41435157b6eca855ace7ca">
   <xsd:schema xmlns:xsd="http://www.w3.org/2001/XMLSchema" xmlns:xs="http://www.w3.org/2001/XMLSchema" xmlns:p="http://schemas.microsoft.com/office/2006/metadata/properties" xmlns:ns2="ea42e40b-1892-49e2-8ca1-113940ebbcdf" xmlns:ns3="f3e2f236-2beb-44d3-88b0-8933ffab591f" targetNamespace="http://schemas.microsoft.com/office/2006/metadata/properties" ma:root="true" ma:fieldsID="38b71fb9b152c8c02de6e8b2ec39cca9" ns2:_="" ns3:_="">
     <xsd:import namespace="ea42e40b-1892-49e2-8ca1-113940ebbcdf"/>
@@ -4025,16 +3926,11 @@
 </ct:contentTypeSchema>
 </file>
 
-<file path=customXml/item3.xml><?xml version="1.0" encoding="utf-8"?>
-<?mso-contentType ?>
-<FormTemplates xmlns="http://schemas.microsoft.com/sharepoint/v3/contenttype/forms">
-  <Display>DocumentLibraryForm</Display>
-  <Edit>DocumentLibraryForm</Edit>
-  <New>DocumentLibraryForm</New>
-</FormTemplates>
+<file path=customXml/item2.xml><?xml version="1.0" encoding="utf-8"?>
+<b:Sources xmlns:b="http://schemas.openxmlformats.org/officeDocument/2006/bibliography" xmlns="http://schemas.openxmlformats.org/officeDocument/2006/bibliography" SelectedStyle="\APASixthEditionOfficeOnline.xsl" StyleName="APA" Version="6"/>
 </file>
 
-<file path=customXml/item4.xml><?xml version="1.0" encoding="utf-8"?>
+<file path=customXml/item3.xml><?xml version="1.0" encoding="utf-8"?>
 <p:properties xmlns:p="http://schemas.microsoft.com/office/2006/metadata/properties" xmlns:xsi="http://www.w3.org/2001/XMLSchema-instance" xmlns:pc="http://schemas.microsoft.com/office/infopath/2007/PartnerControls">
   <documentManagement>
     <lcf76f155ced4ddcb4097134ff3c332f xmlns="ea42e40b-1892-49e2-8ca1-113940ebbcdf">
@@ -4045,15 +3941,16 @@
 </p:properties>
 </file>
 
-<file path=customXml/itemProps1.xml><?xml version="1.0" encoding="utf-8"?>
-<ds:datastoreItem xmlns:ds="http://schemas.openxmlformats.org/officeDocument/2006/customXml" ds:itemID="{14BB6E72-90D1-4D45-942A-95497DDE3A6B}">
-  <ds:schemaRefs>
-    <ds:schemaRef ds:uri="http://schemas.openxmlformats.org/officeDocument/2006/bibliography"/>
-  </ds:schemaRefs>
-</ds:datastoreItem>
+<file path=customXml/item4.xml><?xml version="1.0" encoding="utf-8"?>
+<?mso-contentType ?>
+<FormTemplates xmlns="http://schemas.microsoft.com/sharepoint/v3/contenttype/forms">
+  <Display>DocumentLibraryForm</Display>
+  <Edit>DocumentLibraryForm</Edit>
+  <New>DocumentLibraryForm</New>
+</FormTemplates>
 </file>
 
-<file path=customXml/itemProps2.xml><?xml version="1.0" encoding="utf-8"?>
+<file path=customXml/itemProps1.xml><?xml version="1.0" encoding="utf-8"?>
 <ds:datastoreItem xmlns:ds="http://schemas.openxmlformats.org/officeDocument/2006/customXml" ds:itemID="{B5AA183D-1737-4EAB-864D-11849E4F0181}">
   <ds:schemaRefs>
     <ds:schemaRef ds:uri="http://schemas.microsoft.com/office/2006/metadata/contentType"/>
@@ -4072,15 +3969,15 @@
 </ds:datastoreItem>
 </file>
 
-<file path=customXml/itemProps3.xml><?xml version="1.0" encoding="utf-8"?>
-<ds:datastoreItem xmlns:ds="http://schemas.openxmlformats.org/officeDocument/2006/customXml" ds:itemID="{DD34DAA0-DFB2-4A40-A124-0628E13D0F68}">
+<file path=customXml/itemProps2.xml><?xml version="1.0" encoding="utf-8"?>
+<ds:datastoreItem xmlns:ds="http://schemas.openxmlformats.org/officeDocument/2006/customXml" ds:itemID="{14BB6E72-90D1-4D45-942A-95497DDE3A6B}">
   <ds:schemaRefs>
-    <ds:schemaRef ds:uri="http://schemas.microsoft.com/sharepoint/v3/contenttype/forms"/>
+    <ds:schemaRef ds:uri="http://schemas.openxmlformats.org/officeDocument/2006/bibliography"/>
   </ds:schemaRefs>
 </ds:datastoreItem>
 </file>
 
-<file path=customXml/itemProps4.xml><?xml version="1.0" encoding="utf-8"?>
+<file path=customXml/itemProps3.xml><?xml version="1.0" encoding="utf-8"?>
 <ds:datastoreItem xmlns:ds="http://schemas.openxmlformats.org/officeDocument/2006/customXml" ds:itemID="{78823B98-8995-40B2-B587-B593CBAC33C8}">
   <ds:schemaRefs>
     <ds:schemaRef ds:uri="http://schemas.microsoft.com/office/2006/metadata/properties"/>
@@ -4089,4 +3986,12 @@
     <ds:schemaRef ds:uri="f3e2f236-2beb-44d3-88b0-8933ffab591f"/>
   </ds:schemaRefs>
 </ds:datastoreItem>
+</file>
+
+<file path=customXml/itemProps4.xml><?xml version="1.0" encoding="utf-8"?>
+<ds:datastoreItem xmlns:ds="http://schemas.openxmlformats.org/officeDocument/2006/customXml" ds:itemID="{DD34DAA0-DFB2-4A40-A124-0628E13D0F68}">
+  <ds:schemaRefs>
+    <ds:schemaRef ds:uri="http://schemas.microsoft.com/sharepoint/v3/contenttype/forms"/>
+  </ds:schemaRefs>
+</ds:datastoreItem>
 </file>
</xml_diff>